<commit_message>
LEGAL_PROPOSITION_20260922 applied: programme.js resume reads legal intake fields, candidate.html Step 6 email carries parcours
</commit_message>
<xml_diff>
--- a/views/convention_template_cpf.docx
+++ b/views/convention_template_cpf.docx
@@ -1329,116 +1329,71 @@
         </w:rPr>
       </w:pPr>
     </w:p>
-    <w:p>
-      <w:pPr>
-        <w:pStyle w:val="Normal10"/>
-        <w:ind w:left="-709" w:right="-431"/>
-        <w:rPr>
-          <w:rFonts w:ascii="Avenir Next Regular" w:hAnsi="Avenir Next Regular"/>
-          <w:b/>
-          <w:bCs/>
-          <w:color w:val="1F497D" w:themeColor="text2"/>
-          <w:lang w:val="fr-FR"/>
-        </w:rPr>
-        <w:sectPr>
-          <w:type w:val="continuous"/>
-          <w:pgSz w:w="11900" w:h="16820" w:code="297"/>
-          <w:pgMar w:top="1560" w:right="1274" w:bottom="1005" w:left="1418" w:header="0" w:footer="1106" w:gutter="0"/>
-          <w:cols w:space="708"/>
-          <w:docGrid w:linePitch="360"/>
-        </w:sectPr>
-      </w:pPr>
-      <w:r>
-        <w:rPr>
-          <w:rFonts w:ascii="Avenir Next Regular" w:hAnsi="Avenir Next Regular"/>
-          <w:b/>
-          <w:bCs/>
-          <w:color w:val="1F497D" w:themeColor="text2"/>
-          <w:lang w:val="fr-FR"/>
-        </w:rPr>
-        <w:t xml:space="preserve">Pour </w:t>
-      </w:r>
-      <w:r>
-        <w:rPr>
-          <w:rFonts w:ascii="Avenir Next Regular" w:hAnsi="Avenir Next Regular"/>
-          <w:b/>
-          <w:bCs/>
-          <w:color w:val="1F497D" w:themeColor="text2"/>
-          <w:lang w:val="fr-FR"/>
-        </w:rPr>
-        <w:t>Madame Kim MENIN</w:t>
-      </w:r>
-      <w:r>
-        <w:rPr>
-          <w:rFonts w:ascii="Avenir Next Regular" w:hAnsi="Avenir Next Regular"/>
-          <w:b/>
-          <w:bCs/>
-          <w:color w:val="1F497D" w:themeColor="text2"/>
-          <w:lang w:val="fr-FR"/>
-        </w:rPr>
-        <w:tab/>
-      </w:r>
-      <w:r>
-        <w:rPr>
-          <w:rFonts w:ascii="Avenir Next Regular" w:hAnsi="Avenir Next Regular"/>
-          <w:b/>
-          <w:bCs/>
-          <w:color w:val="1F497D" w:themeColor="text2"/>
-          <w:lang w:val="fr-FR"/>
-        </w:rPr>
-        <w:tab/>
-      </w:r>
-      <w:r>
-        <w:rPr>
-          <w:rFonts w:ascii="Avenir Next Regular" w:hAnsi="Avenir Next Regular"/>
-          <w:b/>
-          <w:bCs/>
-          <w:color w:val="1F497D" w:themeColor="text2"/>
-          <w:lang w:val="fr-FR"/>
-        </w:rPr>
-        <w:tab/>
-      </w:r>
-      <w:r>
-        <w:rPr>
-          <w:rFonts w:ascii="Avenir Next Regular" w:hAnsi="Avenir Next Regular"/>
-          <w:b/>
-          <w:bCs/>
-          <w:color w:val="1F497D" w:themeColor="text2"/>
-          <w:lang w:val="fr-FR"/>
-        </w:rPr>
-        <w:tab/>
-      </w:r>
-      <w:r>
-        <w:rPr>
-          <w:rFonts w:ascii="Avenir Next Regular" w:hAnsi="Avenir Next Regular"/>
-          <w:b/>
-          <w:bCs/>
-          <w:color w:val="1F497D" w:themeColor="text2"/>
-          <w:lang w:val="fr-FR"/>
-        </w:rPr>
-        <w:tab/>
-      </w:r>
-      <w:r>
-        <w:rPr>
-          <w:rFonts w:ascii="Avenir Next Regular" w:hAnsi="Avenir Next Regular"/>
-          <w:b/>
-          <w:bCs/>
-          <w:color w:val="1F497D" w:themeColor="text2"/>
-          <w:lang w:val="fr-FR"/>
-        </w:rPr>
-        <w:tab/>
-        <w:t>P</w:t>
-      </w:r>
-      <w:r>
-        <w:rPr>
-          <w:rFonts w:ascii="Avenir Next Regular" w:hAnsi="Avenir Next Regular"/>
-          <w:b/>
-          <w:color w:val="1F497D" w:themeColor="text2"/>
-          <w:lang w:val="fr-FR"/>
-        </w:rPr>
-        <w:t>our l’organisme LINGUAID FRANCE</w:t>
-      </w:r>
-    </w:p>
+    <w:tbl>
+      <w:tblPr>
+        <w:tblW w:w="9360" w:type="dxa"/>
+        <w:tblBorders>
+          <w:top w:val="none" w:sz="0" w:space="0" w:color="auto"/>
+          <w:left w:val="none" w:sz="0" w:space="0" w:color="auto"/>
+          <w:bottom w:val="none" w:sz="0" w:space="0" w:color="auto"/>
+          <w:right w:val="none" w:sz="0" w:space="0" w:color="auto"/>
+          <w:insideH w:val="none" w:sz="0" w:space="0" w:color="auto"/>
+          <w:insideV w:val="none" w:sz="0" w:space="0" w:color="auto"/>
+        </w:tblBorders>
+      </w:tblPr>
+      <w:tblGrid>
+        <w:gridCol w:w="4680"/>
+        <w:gridCol w:w="4680"/>
+      </w:tblGrid>
+      <w:tr>
+        <w:tc>
+          <w:tcPr>
+            <w:tcW w:w="4680" w:type="dxa"/>
+          </w:tcPr>
+          <w:p>
+            <w:r>
+              <w:rPr>
+                <w:rFonts w:ascii="Avenir Next Regular" w:hAnsi="Avenir Next Regular"/>
+                <w:b/>
+                <w:sz w:val="19"/>
+                <w:color w:val="1F4E79"/>
+              </w:rPr>
+              <w:t xml:space="preserve">Pour {{CANDIDATE_NAME}}</w:t>
+            </w:r>
+          </w:p>
+        </w:tc>
+        <w:tc>
+          <w:tcPr>
+            <w:tcW w:w="4680" w:type="dxa"/>
+          </w:tcPr>
+          <w:p>
+            <w:r>
+              <w:rPr>
+                <w:rFonts w:ascii="Avenir Next Regular" w:hAnsi="Avenir Next Regular"/>
+                <w:b/>
+                <w:sz w:val="19"/>
+                <w:color w:val="1F4E79"/>
+              </w:rPr>
+              <w:t xml:space="preserve">Pour l’organisme LINGUAID FRANCE</w:t>
+            </w:r>
+          </w:p>
+        </w:tc>
+      </w:tr>
+      <w:tr>
+        <w:tc>
+          <w:tcPr>
+            <w:tcW w:w="4680" w:type="dxa"/>
+          </w:tcPr>
+          <w:p/>
+        </w:tc>
+        <w:tc>
+          <w:tcPr>
+            <w:tcW w:w="4680" w:type="dxa"/>
+          </w:tcPr>
+          <w:p/>
+        </w:tc>
+      </w:tr>
+    </w:tbl>
     <w:p>
       <w:pPr>
         <w:pStyle w:val="Normal10"/>

</xml_diff>